<commit_message>
Full citation-fitness re-audit: 31 papers / 83 sites verified, zero hallucinations; 3 thesis-lineage attribution fixes
- Every reference and every in-text citation site in report v5 + thesis v4
  re-verified against the actual papers (6 parallel verifiers + orchestrator
  cross-checks). All bibliographic entries correct, incl. the post-ledger
  Hong [16] insertion and Phi-4-mini TR swap; HarmBench N=512/30% quotes
  verbatim-confirmed.
- 3 sentences attached author synthesis to papers that don't make the claim
  (inter-judge-agreement "often unreported"; rubric-design cite placement;
  Egashira mislabelled as optimised-jailbreak work). Fixed across the four
  thesis/interim builders + both LaTeX mirrors; docx + PDFs + zips
  regenerated; audit record in REPORT_CLAIM_AUDIT_v5.md §2d.

Gates: verify-claims 86/86, surfaces 264/264, pytest 437, agent-check 8/8.

Co-Authored-By: Claude Fable 5 <noreply@anthropic.com>
</commit_message>
<xml_diff>
--- a/docs/FYP_Interim_2026-07-10.docx
+++ b/docs/FYP_Interim_2026-07-10.docx
@@ -1064,7 +1064,7 @@
           <w:sz w:val="24"/>
           <w:szCs w:val="24"/>
         </w:rPr>
-        <w:t xml:space="preserve">Three observations define the gap this interim report addresses. First, the quantization–safety literature reports inconsistent, method- and model-dependent effects [4]–[5], so cross-paper comparison cannot settle whether quantization shifts safety; a controlled, matched-pair design that isolates quantization is required. Second, harmful compliance is frequently scored by refusal-matching rather than by a validated classifier, so a reported “attack success” may be a scoring artefact, and where LLM judges are used their inter-judge agreement is often left unreported [11], [12], yet the benchmark’s own fine-tuned classifier exists precisely to avoid this [3]. Third, studies that do measure quantization rarely separate a safety change from a capability change, almost none trace the effect across more than one precision or quantization method, and almost none evaluate at the benchmark’s own standardized generation budget, even though the measured attack-success rate depends drastically on it [3].</w:t>
+        <w:t xml:space="preserve">Three observations define the gap this interim report addresses. First, the quantization–safety literature reports inconsistent, method- and model-dependent effects [4]–[5], so cross-paper comparison cannot settle whether quantization shifts safety; a controlled, matched-pair design that isolates quantization is required. Second, harmful compliance is frequently scored by refusal-matching rather than by a validated classifier, so a reported “attack success” may be a scoring artefact, and where LLM judges are used, the judge literature cautions that their reliability must itself be evaluated rather than assumed [11], [12], yet the benchmark’s own fine-tuned classifier exists precisely to avoid this [3]. Third, studies that do measure quantization rarely separate a safety change from a capability change, almost none trace the effect across more than one precision or quantization method, and almost none evaluate at the benchmark’s own standardized generation budget, even though the measured attack-success rate depends drastically on it [3].</w:t>
       </w:r>
     </w:p>
     <w:p>
@@ -6868,7 +6868,7 @@
           <w:sz w:val="24"/>
           <w:szCs w:val="24"/>
         </w:rPr>
-        <w:t xml:space="preserve">The primary safety construct is scored by the benchmark’s own fine-tuned classifier rather than refusal matching, and the cross-judge agreement (Cohen’s κ 0.68–0.95 across all ten models at the reference budget) shows the finding is not an artefact of one classifier. A stratified human-label audit (200 items, single annotator — the author — HarmBench rubric) now grounds this against truth: the classifier agrees with the human at Cohen’s κ 0.59 versus the regex’s 0.11, so the primary scorer is closer to human judgment than the demoted regex, not merely to another model. Two sampling caveats scope those figures symmetrically: the subset deliberately over-weights judge-vs-regex disagreement cases (roughly three times their population rate), so the κ values are a disagreement-enriched contrast rather than a population estimate; and the annotation view was capped at the first 2,000 characters of each response while the scorers saw the full text, which plausibly inflates measured disagreement, though the direction is not strictly identified, since a harmful-looking prefix followed by a benign completion cuts the other way. The residual is honestly bounded — κ 0.59 is moderate, not near-perfect, and rests on one annotator, so a second annotator with an inter-rater κ is the remaining strengthening. Over-refusal remains regex-scored, a known weaker construct: XSTest’s own protocol relies on LLM-based three-way labelling (full compliance / partial refusal / full refusal) rather than a released fine-tuned classifier, whereas this study deliberately substitutes a deterministic binary refusal regex — a reproducibility-motivated deviation that yields a coarser refusal / non-refusal reading — so the single over-refusal contrast that survives multiplicity correction (Phi-4-mini’s −0.048 decrease) is a reproducible non-refusal-rate change rather than a classifier-validated over-refusal shift. Run as a sensitivity check, an independent gpt-4o three-class refusal judge (XSTest’s own full-compliance / partial-refusal / full-refusal taxonomy) re-scored all 3,750 saved benign responses with zero parse failures, the regex kept primary, and did not reproduce that decrease: the direction reverses to ΔOR +0.016 under a strict full-refusal reading (McNemar p = 0.597) and sits at −0.004 under a broad partial-or-full reading (p = 1.000), both non-significant, and the two scorers disagree substantially (the judge counts about four times more refusals, mean over-refusal 0.171 strict versus regex 0.044; per-alias Cohen’s κ −0.01 to 0.50). The −0.048 survivor is therefore scorer-dependent, and a completed 200-item blinded human audit (single annotator, disagreement-enriched draw, a mechanical Outcome J carried with one disclosed protocol deviation, pre-registration §8) resolves the weighting: the judge aligns substantially better with the annotator than the regex on this construct (strict κ 0.485 versus −0.006; the regex recovered only 2 of the annotator’s 63 full refusals), so the contrast is carried as most plausibly a measurement artifact of the regex scorer, with the regex retained as the original pre-specified scorer-of-record and a second annotator the residual strengthening. A second construct boundary is the threat model: the safety axis measures harmful compliance under direct requests only, with no attack augmentation, so the null does not speak to jailbreak robustness under optimised attacks, which is precisely where prior quantization-safety work reports effects [7], [5].</w:t>
+        <w:t xml:space="preserve">The primary safety construct is scored by the benchmark’s own fine-tuned classifier rather than refusal matching, and the cross-judge agreement (Cohen’s κ 0.68–0.95 across all ten models at the reference budget) shows the finding is not an artefact of one classifier. A stratified human-label audit (200 items, single annotator — the author — HarmBench rubric) now grounds this against truth: the classifier agrees with the human at Cohen’s κ 0.59 versus the regex’s 0.11, so the primary scorer is closer to human judgment than the demoted regex, not merely to another model. Two sampling caveats scope those figures symmetrically: the subset deliberately over-weights judge-vs-regex disagreement cases (roughly three times their population rate), so the κ values are a disagreement-enriched contrast rather than a population estimate; and the annotation view was capped at the first 2,000 characters of each response while the scorers saw the full text, which plausibly inflates measured disagreement, though the direction is not strictly identified, since a harmful-looking prefix followed by a benign completion cuts the other way. The residual is honestly bounded — κ 0.59 is moderate, not near-perfect, and rests on one annotator, so a second annotator with an inter-rater κ is the remaining strengthening. Over-refusal remains regex-scored, a known weaker construct: XSTest’s own protocol relies on LLM-based three-way labelling (full compliance / partial refusal / full refusal) rather than a released fine-tuned classifier, whereas this study deliberately substitutes a deterministic binary refusal regex — a reproducibility-motivated deviation that yields a coarser refusal / non-refusal reading — so the single over-refusal contrast that survives multiplicity correction (Phi-4-mini’s −0.048 decrease) is a reproducible non-refusal-rate change rather than a classifier-validated over-refusal shift. Run as a sensitivity check, an independent gpt-4o three-class refusal judge (XSTest’s own full-compliance / partial-refusal / full-refusal taxonomy) re-scored all 3,750 saved benign responses with zero parse failures, the regex kept primary, and did not reproduce that decrease: the direction reverses to ΔOR +0.016 under a strict full-refusal reading (McNemar p = 0.597) and sits at −0.004 under a broad partial-or-full reading (p = 1.000), both non-significant, and the two scorers disagree substantially (the judge counts about four times more refusals, mean over-refusal 0.171 strict versus regex 0.044; per-alias Cohen’s κ −0.01 to 0.50). The −0.048 survivor is therefore scorer-dependent, and a completed 200-item blinded human audit (single annotator, disagreement-enriched draw, a mechanical Outcome J carried with one disclosed protocol deviation, pre-registration §8) resolves the weighting: the judge aligns substantially better with the annotator than the regex on this construct (strict κ 0.485 versus −0.006; the regex recovered only 2 of the annotator’s 63 full refusals), so the contrast is carried as most plausibly a measurement artifact of the regex scorer, with the regex retained as the original pre-specified scorer-of-record and a second annotator the residual strengthening. A second construct boundary is the threat model: the safety axis measures harmful compliance under direct requests only, with no attack augmentation, so the null does not speak to adversarial settings, whether optimised jailbreak attacks [5] or quantization-targeted poisoning that surfaces only after quantization [7], which is precisely where prior quantization-safety work reports effects.</w:t>
       </w:r>
     </w:p>
     <w:p>

</xml_diff>

<commit_message>
T44 S9 R1: content batch — 16 FS items + polish remediated across all 8 surfaces; Connor 1987 added (report 32 refs); tex mirrors re-based
FS-1,7,8,9,10,11,12,13,14,15,19doc,20,21,22,25 fixed; FS-23 residuals dispositioned
(a,c,f fixed; b refuted by timestamp evidence; d already-remediated; e waived).
All gates green: verify-claims 86/86, surfaces 264/264, citation 13/13, pytest 449.

Co-Authored-By: Claude Opus 4.8 <noreply@anthropic.com>
</commit_message>
<xml_diff>
--- a/docs/FYP_Interim_2026-07-10.docx
+++ b/docs/FYP_Interim_2026-07-10.docx
@@ -182,7 +182,7 @@
           <w:sz w:val="26"/>
           <w:szCs w:val="26"/>
         </w:rPr>
-        <w:t xml:space="preserve">Interim Report · 10 July 2026</w:t>
+        <w:t xml:space="preserve">Interim Report · 10 July 2026 · content revised through 22 July 2026</w:t>
       </w:r>
     </w:p>
     <w:p>
@@ -2553,7 +2553,7 @@
           <w:sz w:val="24"/>
           <w:szCs w:val="24"/>
         </w:rPr>
-        <w:t xml:space="preserve">HarmBench Attack Success Rate is scored by the official HarmBench classifier (cais/HarmBench-Llama-2-13b-cls) [3], run in full precision so that the reference instrument is not itself confounded by quantization. A second, architecturally independent judge (GPT-4o) re-scores the same generations as a robustness check [11], [12]. A deterministic refusal regex is retained only as a secondary, transparent proxy. This choice is itself a research object: this report reports the agreement between scorers and shows that the regex over-counts, which is why it is demoted. MMLU and ARC use deterministic exact match; XSTest over-refusal uses the regex (the HarmBench classifier judges harmful compliance only).</w:t>
+        <w:t xml:space="preserve">HarmBench Attack Success Rate is scored by the official HarmBench classifier (cais/HarmBench-Llama-2-13b-cls) [3] — prompted with the Hugging Face model-card template rather than the GitHub evaluation-harness variant, so absolute ASR levels are not directly harness-comparable while matched-pair deltas are unaffected — run in full precision so that the reference instrument is not itself confounded by quantization. A second, architecturally independent judge (GPT-4o; run 2026-06-14 — the API alias’s dated snapshot was not recorded, so the revision-pinned open-weight LlamaGuard third judge is the reproducible arm) re-scores the same generations as a robustness check [11], [12]. A deterministic refusal regex is retained only as a secondary, transparent proxy. This choice is itself a research object: this report reports the agreement between scorers and shows that the regex over-counts, which is why it is demoted. MMLU and ARC use deterministic exact match; XSTest over-refusal uses the regex (the HarmBench classifier judges harmful compliance only).</w:t>
       </w:r>
     </w:p>
     <w:p>
@@ -3047,7 +3047,7 @@
           <w:sz w:val="24"/>
           <w:szCs w:val="24"/>
         </w:rPr>
-        <w:t xml:space="preserve">All inference uses greedy decoding at temperature 0.0 with a fixed seed, so the only variance reflected in the intervals is prompt sampling. Generation uses HarmBench’s standardized 512-token evaluation budget as the primary configuration: the HarmBench authors show the number of tokens generated during evaluation can change the measured attack-success rate by up to 30 percent and standardize the parameter to N = 512 for exactly that reason [3]. An initial 128-token run is retained, unchanged, as a controlled generation-length comparison (§6.3). Deltas carry paired-bootstrap 95% confidence intervals [15] (2,000 resamples, seed 42), resampled by prompt identity so that both members of a pair see the same prompts in the same order. Every HarmBench contrast is tested with McNemar’s exact paired test [16]; significance is reported both uncorrected and under a Benjamini-Hochberg false-discovery-rate correction [17] over the twenty-contrast primary family; a power analysis reports the minimum detectable effect (about 0.04–0.09 per pair at n = 200); and a multi-seed sensitivity arm (temperature 0.7, five seeds, all five pairs) estimates generation-level variance.</w:t>
+        <w:t xml:space="preserve">All inference uses greedy decoding at temperature 0.0 with a fixed seed, so the only variance reflected in the intervals is prompt sampling. Generation uses HarmBench’s standardized 512-token evaluation budget as the primary configuration: the HarmBench authors show the number of tokens generated during evaluation can change the measured attack-success rate by up to 30 percent and standardize the parameter to N = 512 for exactly that reason [3]. An initial 128-token run is retained, unchanged, as a controlled generation-length comparison (§6.3). Deltas carry paired-bootstrap 95% confidence intervals [15] (2,000 resamples, seed 42), resampled by prompt identity so that both members of a pair see the same prompts in the same order. Every HarmBench contrast is tested with McNemar’s exact paired test [16]; significance is reported both uncorrected and under a Benjamini-Hochberg false-discovery-rate correction [17] over the twenty-contrast primary family; a power analysis (Connor’s normal-approximation treatment of the paired McNemar design [18]) reports the minimum detectable effect (about 0.04–0.09 per pair at n = 200); and a multi-seed sensitivity arm (temperature 0.7, five seeds, all five pairs) estimates generation-level variance.</w:t>
       </w:r>
     </w:p>
     <w:p>
@@ -3990,7 +3990,7 @@
           <w:sz w:val="24"/>
           <w:szCs w:val="24"/>
         </w:rPr>
-        <w:t xml:space="preserve">The first result concerns the instrument. The refusal regex reports far higher Attack Success Rates than the HarmBench classifier, and the gap is uneven by family. Cohen’s κ [18] between the regex and the classifier at the 512-token reference budget is fair-to-moderate for the Qwen and Mistral models and substantial or better for Llama and Phi (verbal bands per Landis and Koch [19]) (Table 6.1), because models that produce a large volume of ambiguous, non-refusing-but-benign text are exactly those the regex mis-scores. In aggregate the classifier’s harmful set is a near-strict subset of the regex’s (28 judge-only labels against 325 regex-only across the ten models), so the disagreement is overwhelmingly one-directional over-counting. At the retired 128-token budget, adopting the classifier had moved the significant increases wholesale: the regex placed them on Qwen3-4B and Mistral, the classifier on Qwen3-1.7B alone. At the reference budget it removes every significant increase entirely (§6.2). A stratified human-label audit (200 items, single annotator) confirms the direction against truth rather than against another model: the classifier agrees with a human annotator at Cohen’s κ 0.59 (moderate) while the regex agrees at only 0.11 (slight) — against the human’s 200 labels the regex over-flagged 101 responses as harmful to the classifier’s 18, and the human, flagging 37, applied the highest bar of the three — so refusal-counting over-states harmful compliance relative to human judgment, not merely relative to the classifier; the classifier is a better scorer, though at moderate agreement, not a perfect human proxy. In safety evaluation the choice of scorer is not a detail: it can change the conclusion.</w:t>
+        <w:t xml:space="preserve">The first result concerns the instrument. The refusal regex reports far higher Attack Success Rates than the HarmBench classifier, and the gap is uneven by family. Cohen’s κ [19] between the regex and the classifier at the 512-token reference budget is fair-to-moderate for the Qwen and Mistral models and substantial or better for Llama and Phi (verbal bands per Landis and Koch [20]) (Table 6.1), because models that produce a large volume of ambiguous, non-refusing-but-benign text are exactly those the regex mis-scores. In aggregate the classifier’s harmful set is a near-strict subset of the regex’s (28 judge-only labels against 325 regex-only across the ten models), so the disagreement is overwhelmingly one-directional over-counting. At the retired 128-token budget, adopting the classifier had moved the significant increases wholesale: the regex placed them on Qwen3-4B and Mistral, the classifier on Qwen3-1.7B alone. At the reference budget it removes every significant increase entirely (§6.2). A stratified human-label audit (200 items, single annotator) confirms the direction against truth rather than against another model: the classifier agrees with a human annotator at Cohen’s κ 0.59 (moderate) while the regex agrees at only 0.11 (slight) — against the human’s 200 labels the regex over-flagged 101 responses as harmful to the classifier’s 18, and the human, flagging 37, applied the highest bar of the three — so refusal-counting over-states harmful compliance relative to human judgment, not merely relative to the classifier; the classifier is a better scorer, though at moderate agreement, not a perfect human proxy. In safety evaluation the choice of scorer is not a detail: it can change the conclusion.</w:t>
       </w:r>
     </w:p>
     <w:tbl>
@@ -5765,7 +5765,7 @@
           <w:sz w:val="24"/>
           <w:szCs w:val="24"/>
         </w:rPr>
-        <w:t xml:space="preserve">To probe the boundary behaviour behind the 128-token signal, a derived analysis measured each model’s first-token refusal margin in fp16 and under NF4, following the observation that quantization most affects low-confidence, near-boundary decisions [20]. A thin baseline margin does predict which prompts flip, but only weakly within a family, and the flips are symmetric: quantization destabilises the decision boundary in both directions rather than eroding refusals one-directionally. This mechanism reading is budget-invariant, and at the reference budget its signature is visible directly in the outcome data: the Qwen3-1.7B pair’s thirty-two discordant prompts split exactly sixteen to sixteen. The change is more consistent with generic capability-driven boundary instability than a targeted alignment shift, reinforcing the capability-anchored reading.</w:t>
+        <w:t xml:space="preserve">To probe the boundary behaviour behind the 128-token signal, a derived analysis measured each model’s first-token refusal margin in fp16 and under NF4, following the observation that quantization most affects low-confidence, near-boundary decisions [21]. A thin baseline margin does predict which prompts flip, but only weakly within a family, and the flips are symmetric: quantization destabilises the decision boundary in both directions rather than eroding refusals one-directionally. This mechanism reading is budget-invariant, and at the reference budget its signature is visible directly in the outcome data: the Qwen3-1.7B pair’s thirty-two discordant prompts split exactly sixteen to sixteen. The change is more consistent with generic capability-driven boundary instability than a targeted alignment shift, reinforcing the capability-anchored reading.</w:t>
       </w:r>
     </w:p>
     <w:p>
@@ -5795,7 +5795,7 @@
           <w:sz w:val="24"/>
           <w:szCs w:val="24"/>
         </w:rPr>
-        <w:t xml:space="preserve">Adding INT8 shows the effect is not a smooth function of bit-width. On capability the result is a clean cliff at four-bit: every INT8 MMLU and ARC point estimate sits within about 1.3 percentage points of fp16, far below the multiplicity-robust NF4 losses of three to nine points and below the study’s detection floor, while the significant capability losses are all at NF4. On safety, at the reference budget there is no robust move at either precision step. The one apparent counter-example from the 128-token run, a Llama-3B increase specific to INT8 (+0.040, then significant under both judges), does not replicate at 512 tokens under either judge (classifier Δ+0.005, McNemar p = 1.000; GPT-4o Δ+0.010, p = 0.688): it was a 128-era budget artefact — attributable, since Llama truncates at only 3–4 percent (§6.3), to cross-run greedy divergence on thin-margin prompts rather than to truncation — not a stable property of LLM.int8 on this model. Table 6.3 shows the sweep.</w:t>
+        <w:t xml:space="preserve">Adding INT8 shows the effect is not a smooth function of bit-width. On capability the result is a clean cliff at four-bit: every INT8 MMLU and ARC point estimate sits within about 1.3 percentage points of fp16 — paired per-item McNemar contrasts, none significant — far below the multiplicity-robust NF4 losses of three to nine points, while the significant capability losses are all at NF4. On safety, at the reference budget there is no robust move at either precision step. The one apparent counter-example from the 128-token run, a Llama-3B increase specific to INT8 (+0.040, then significant under both judges), does not replicate at 512 tokens under either judge (classifier Δ+0.005, McNemar p = 1.000; GPT-4o Δ+0.010, p = 0.688): it was a 128-era budget artefact — attributable, since Llama truncates at only 3–4 percent (§6.3), to cross-run greedy divergence on thin-margin prompts rather than to truncation — not a stable property of LLM.int8 on this model. Table 6.3 shows the sweep.</w:t>
       </w:r>
     </w:p>
     <w:tbl>
@@ -6763,7 +6763,7 @@
           <w:sz w:val="24"/>
           <w:szCs w:val="24"/>
         </w:rPr>
-        <w:t xml:space="preserve">With 200 HarmBench prompts the confidence intervals are wide (about ±0.05), and a power analysis makes the detection floor explicit: at n = 200 and the observed discordant rates, the minimum detectable ΔASR for 80 percent power is about 0.06 for a representative pair (the per-pair values span 0.04–0.09). The predominance of nulls on the safety axis is therefore a power-bounded null (“no detectable change at n = 200”), not a proven zero, and the multi-seed sign-consistency for the smallest pair (§6.3) is compatible with a real effect below that floor.</w:t>
+        <w:t xml:space="preserve">With 200 HarmBench prompts the confidence intervals are wide (about ±0.05), and a power analysis [18] makes the detection floor explicit: at n = 200 and the observed discordant rates, the minimum detectable ΔASR for 80 percent power is about 0.06 for a representative pair (the per-pair values span 0.04–0.09). The predominance of nulls on the safety axis is therefore a power-bounded null (“no detectable change at n = 200”), not a proven zero, and the multi-seed sign-consistency for the smallest pair (§6.3) is compatible with a real effect below that floor.</w:t>
       </w:r>
     </w:p>
     <w:p>
@@ -6898,7 +6898,7 @@
           <w:sz w:val="24"/>
           <w:szCs w:val="24"/>
         </w:rPr>
-        <w:t xml:space="preserve">External validity is bounded by five pairs, one decoding regime (greedy primary, with a five-pair multi-seed arm), two bitsandbytes methods, direct requests only, and English-only text; the cross-family, cross-precision, and cross-budget sweeps widen it but do not make it general. Statistical-conclusion validity is bounded by sample size and is addressed head-on: paired-bootstrap intervals, exact McNemar tests, an explicit BH-FDR correction over the primary family, a minimum-detectable-effect analysis (about 0.04–0.09 per pair), and a two-layer evidence status rather than bare significance.</w:t>
+        <w:t xml:space="preserve">External validity is bounded by five pairs, one decoding regime (greedy primary, with a five-pair multi-seed arm; the two Qwen3 pairs run in non-default non-thinking mode, with the quantization × thinking-mode interaction untested), two bitsandbytes methods, direct requests only, and English-only text; the cross-family, cross-precision, and cross-budget sweeps widen it but do not make it general. Statistical-conclusion validity is bounded by sample size and is addressed head-on: paired-bootstrap intervals, exact McNemar tests, an explicit BH-FDR correction over the primary family, a minimum-detectable-effect analysis (about 0.04–0.09 per pair), and a two-layer evidence status rather than bare significance.</w:t>
       </w:r>
     </w:p>
     <w:p>
@@ -7041,7 +7041,7 @@
           <w:sz w:val="24"/>
           <w:szCs w:val="24"/>
         </w:rPr>
-        <w:t xml:space="preserve">Generation stopping: the generation loop halts only on the tokenizer’s default end-of-sequence token, so responses can run past the model’s completed answer into synthetic follow-up turns (the model role-playing both sides of a dialogue), which skip_special_tokens decoding saves as a run-on. This is a decoding-configuration artefact: it inflates response length but is produced identically by both pair members, so it cancels in every matched-pair delta, and the full-response classifier still scores any harmful content a continuation might contain. Stopping at the chat turn-end token is a straightforward fix for future runs.</w:t>
+        <w:t xml:space="preserve">Generation stopping: the generation loop halts only on the tokenizer’s default end-of-sequence token, so responses can run past the model’s completed answer into synthetic follow-up turns (the model role-playing both sides of a dialogue), which skip_special_tokens decoding saves as a run-on. This is a decoding-configuration artefact: it inflates response length but is produced identically by both pair members, so its effect is matched across the pair by construction, and the full-response classifier still scores any harmful content a continuation might contain. Stopping at the chat turn-end token is a straightforward fix for future runs.</w:t>
       </w:r>
     </w:p>
     <w:p>
@@ -7106,7 +7106,7 @@
           <w:sz w:val="24"/>
           <w:szCs w:val="24"/>
         </w:rPr>
-        <w:t xml:space="preserve">The experimental programme is complete. All five matched pairs across four families (Qwen3-1.7B, Qwen3-4B, Llama-3.2-3B-Instruct, Mistral-7B-Instruct-v0.3, and Phi-4-mini-instruct) have been evaluated at three precisions (fp16, INT8, NF4) on all four benchmarks (HarmBench, XSTest, MMLU, and ARC-Challenge), at both HarmBench’s 512-token reference budget (the primary study) and an initial 128-token budget (retained as a controlled comparison), on the NTU TC1 GPU cluster. Harmful compliance has been scored by the official HarmBench classifier and cross-checked by a second, architecturally independent judge (GPT-4o) across all ten models and by an open-weight third judge (Llama-Guard-3-8B [21], revision-pinned) across all fifteen aliases — Cohen’s κ 0.36–0.92 against the classifier over the ten base/NF4 aliases, every per-pair ΔASR non-significant; a reproducibility cross-check of a looser “is this response unsafe?” construct, not a second construct-validity oracle — and a single-annotator human-label validation of 200 stratified responses has grounded the primary scorer against human judgment (classifier κ 0.59 versus regex 0.11). Three robustness arms are complete: a five-seed stochastic-decoding sensitivity arm (all five pairs), a first-token refusal-margin mechanism probe, and the fp16 → INT8 → NF4 precision sweep. The analysis is complete, and the supporting framework, automated verification suite, and artifact-derived claim registry are implemented and released.</w:t>
+        <w:t xml:space="preserve">The experimental programme is complete. All five matched pairs across four families (Qwen3-1.7B, Qwen3-4B, Llama-3.2-3B-Instruct, Mistral-7B-Instruct-v0.3, and Phi-4-mini-instruct) have been evaluated at three precisions (fp16, INT8, NF4) on all four benchmarks (HarmBench, XSTest, MMLU, and ARC-Challenge), at both HarmBench’s 512-token reference budget (the primary study) and an initial 128-token budget (retained as a controlled comparison), on the NTU TC1 GPU cluster. Harmful compliance has been scored by the official HarmBench classifier and cross-checked by a second, architecturally independent judge (GPT-4o) across all ten models and by an open-weight third judge (Llama-Guard-3-8B [22], revision-pinned) across all fifteen aliases — Cohen’s κ 0.36–0.92 against the classifier over the ten base/NF4 aliases, every per-pair ΔASR non-significant; a reproducibility cross-check of a looser “is this response unsafe?” construct, not a second construct-validity oracle — and a single-annotator human-label validation of 200 stratified responses has grounded the primary scorer against human judgment (classifier κ 0.59 versus regex 0.11). Three robustness arms are complete: a five-seed stochastic-decoding sensitivity arm (all five pairs), a first-token refusal-margin mechanism probe, and the fp16 → INT8 → NF4 precision sweep. The analysis is complete, and the supporting framework, automated verification suite, and artifact-derived claim registry are implemented and released.</w:t>
       </w:r>
     </w:p>
     <w:p>
@@ -7536,7 +7536,7 @@
           <w:sz w:val="22"/>
           <w:szCs w:val="22"/>
         </w:rPr>
-        <w:t xml:space="preserve">[18] J. Cohen, “A coefficient of agreement for nominal scales,” Educational and Psychological Measurement, vol. 20, no. 1, pp. 37–46, 1960.</w:t>
+        <w:t xml:space="preserve">[18] R. J. Connor, “Sample size for testing differences in proportions for the paired-sample design,” Biometrics, vol. 43, no. 1, pp. 207–211, 1987.</w:t>
       </w:r>
     </w:p>
     <w:p>
@@ -7550,7 +7550,7 @@
           <w:sz w:val="22"/>
           <w:szCs w:val="22"/>
         </w:rPr>
-        <w:t xml:space="preserve">[19] J. R. Landis and G. G. Koch, “The measurement of observer agreement for categorical data,” Biometrics, vol. 33, no. 1, pp. 159–174, 1977.</w:t>
+        <w:t xml:space="preserve">[19] J. Cohen, “A coefficient of agreement for nominal scales,” Educational and Psychological Measurement, vol. 20, no. 1, pp. 37–46, 1960.</w:t>
       </w:r>
     </w:p>
     <w:p>
@@ -7564,7 +7564,7 @@
           <w:sz w:val="22"/>
           <w:szCs w:val="22"/>
         </w:rPr>
-        <w:t xml:space="preserve">[20] I. Proskurina, L. Brun, G. Metzler, and J. Velcin, “When quantization affects confidence of large language models?,” arXiv preprint arXiv:2405.00632, 2024.</w:t>
+        <w:t xml:space="preserve">[20] J. R. Landis and G. G. Koch, “The measurement of observer agreement for categorical data,” Biometrics, vol. 33, no. 1, pp. 159–174, 1977.</w:t>
       </w:r>
     </w:p>
     <w:p>
@@ -7578,7 +7578,7 @@
           <w:sz w:val="22"/>
           <w:szCs w:val="22"/>
         </w:rPr>
-        <w:t xml:space="preserve">[21] H. Inan et al., “Llama Guard: LLM-based input-output safeguard for human-AI conversations,” Meta AI, 2023. arXiv:2312.06674.</w:t>
+        <w:t xml:space="preserve">[21] I. Proskurina, L. Brun, G. Metzler, and J. Velcin, “When quantization affects confidence of large language models?,” in Findings of NAACL, 2024. arXiv:2405.00632.</w:t>
       </w:r>
     </w:p>
     <w:p>
@@ -7592,7 +7592,7 @@
           <w:sz w:val="22"/>
           <w:szCs w:val="22"/>
         </w:rPr>
-        <w:t xml:space="preserve">[22] J. Pineau et al., “Improving reproducibility in machine learning research (a report from the NeurIPS 2019 reproducibility program),” Journal of Machine Learning Research (JMLR), vol. 22, 2021. arXiv:2003.12206.</w:t>
+        <w:t xml:space="preserve">[22] H. Inan et al., “Llama Guard: LLM-based input-output safeguard for human-AI conversations,” Meta AI, 2023. arXiv:2312.06674.</w:t>
       </w:r>
     </w:p>
     <w:p>
@@ -7606,7 +7606,7 @@
           <w:sz w:val="22"/>
           <w:szCs w:val="22"/>
         </w:rPr>
-        <w:t xml:space="preserve">[23] G. K. Sandve, A. Nekrutenko, J. Taylor, and E. Hovig, “Ten simple rules for reproducible computational research,” PLOS Computational Biology, vol. 9, no. 10, e1003285, 2013.</w:t>
+        <w:t xml:space="preserve">[23] J. Pineau et al., “Improving reproducibility in machine learning research (a report from the NeurIPS 2019 reproducibility program),” Journal of Machine Learning Research (JMLR), vol. 22, 2021. arXiv:2003.12206.</w:t>
       </w:r>
     </w:p>
     <w:p>
@@ -7620,7 +7620,7 @@
           <w:sz w:val="22"/>
           <w:szCs w:val="22"/>
         </w:rPr>
-        <w:t xml:space="preserve">[24] G. Wilson, J. Bryan, K. Cranston, J. Kitzes, L. Nederbragt, and T. K. Teal, “Good enough practices in scientific computing,” PLOS Computational Biology, vol. 13, no. 6, e1005510, 2017.</w:t>
+        <w:t xml:space="preserve">[24] G. K. Sandve, A. Nekrutenko, J. Taylor, and E. Hovig, “Ten simple rules for reproducible computational research,” PLOS Computational Biology, vol. 9, no. 10, e1003285, 2013.</w:t>
       </w:r>
     </w:p>
     <w:p>
@@ -7634,7 +7634,21 @@
           <w:sz w:val="22"/>
           <w:szCs w:val="22"/>
         </w:rPr>
-        <w:t xml:space="preserve">[25] A. M. Smith et al., “Journal of Open Source Software (JOSS): Design and first-year review,” arXiv preprint arXiv:1707.02264, 2017.</w:t>
+        <w:t xml:space="preserve">[25] G. Wilson, J. Bryan, K. Cranston, J. Kitzes, L. Nederbragt, and T. K. Teal, “Good enough practices in scientific computing,” PLOS Computational Biology, vol. 13, no. 6, e1005510, 2017.</w:t>
+      </w:r>
+    </w:p>
+    <w:p>
+      <w:pPr>
+        <w:spacing w:after="90" w:line="264"/>
+        <w:ind w:left="400" w:hanging="400"/>
+      </w:pPr>
+      <w:r>
+        <w:rPr>
+          <w:rFonts w:ascii="Times New Roman" w:cs="Times New Roman" w:eastAsia="Times New Roman" w:hAnsi="Times New Roman"/>
+          <w:sz w:val="22"/>
+          <w:szCs w:val="22"/>
+        </w:rPr>
+        <w:t xml:space="preserve">[26] A. M. Smith et al., “Journal of Open Source Software (JOSS): Design and first-year review,” arXiv preprint arXiv:1707.02264, 2017.</w:t>
       </w:r>
     </w:p>
     <w:p>
@@ -7665,7 +7679,7 @@
           <w:sz w:val="24"/>
           <w:szCs w:val="24"/>
         </w:rPr>
-        <w:t xml:space="preserve">All code, configuration, and redacted result artefacts are in the project repository. The analysis reproduces byte-for-byte from the committed sidecars without a GPU; full experiments require the gated model weights and a CUDA GPU. The project maps to the ML Reproducibility Checklist [22]: models and algorithms are described (Chapters 3–4); datasets, splits, and sample counts are recorded in each run summary; code and declared dependencies are released; hyper-parameters and decoding controls are recorded in every summary; the compute infrastructure is recorded; and significance procedures are specified, with multiple comparisons disclosed. The dependency set is declared with minimum-version floors (a lockfile with exact pins is a future hardening step). The repository follows recognised research-software practice (scripts rather than manual steps, fixed seeds, explicit dependencies, and a documented project structure [23], [24]) and is packaged for reuse in line with open-source-software peer-review norms [25]. Raw generations are gitignored and hash-pinned; only redacted sidecars (identifiers, booleans, scalars) are released, so the study is reproducible without redistributing harmful text. The primary artefacts live under results_512/ (the 512-token study), with the 128-token run retained under results/ as the generation-length comparison; a checksum manifest pins 300 immutable raw files across both trees and the multi-seed arm.</w:t>
+        <w:t xml:space="preserve">All code, configuration, and redacted result artefacts are in the project repository. The analysis reproduces byte-for-byte from the committed sidecars without a GPU; full experiments require the gated model weights and a CUDA GPU. The project maps to the ML Reproducibility Checklist [23]: models and algorithms are described (Chapters 3–4); datasets, splits, and sample counts are recorded in each run summary; code and declared dependencies are released; hyper-parameters and decoding controls are recorded in every summary; the compute infrastructure is recorded; and significance procedures are specified, with multiple comparisons disclosed. The dependency set is declared with minimum-version floors (a lockfile with exact pins is a future hardening step). The repository follows recognised research-software practice (scripts rather than manual steps, fixed seeds, explicit dependencies, and a documented project structure [24], [25]) and is packaged for reuse in line with open-source-software peer-review norms [26]. Raw generations are gitignored and hash-pinned; only redacted sidecars (identifiers, booleans, scalars) are released, so the study is reproducible without redistributing harmful text. The primary artefacts live under results_512/ (the 512-token study), with the 128-token run retained under results/ as the generation-length comparison; a checksum manifest pins 340 immutable raw files across both trees and the multi-seed arm.</w:t>
       </w:r>
     </w:p>
     <w:p>

</xml_diff>